<commit_message>
Apply 6 pipeline quality fixes and re-validate accepted tasks
Pipeline fixes:
1. Markdown H1 dedup in renderer.py
2. Collapse duplicate attachments in synthesis.py
3. Rubric seed grounding validator in hard_quality.py
4. Strengthened system prompts (rubric constraint + XBRL concept warning)
5. rubric_grounded check in LLM consistency validator
6. Attachment body hash dedup in orchestrator.py

Re-validated existing tasks with new validators. 50 accepted tasks remain
(lawyer 15, financial 16, SWE 19). Removed rejected tasks from accepted/.

Co-Authored-By: Claude Opus 4.7 <noreply@anthropic.com>
</commit_message>
<xml_diff>
--- a/data/deliverables/sc_0c1a8135b9adc067/legal_memo.docx
+++ b/data/deliverables/sc_0c1a8135b9adc067/legal_memo.docx
@@ -32,7 +32,7 @@
         <w:tab/>
       </w:r>
       <w:r>
-        <w:t>Associate</w:t>
+        <w:t>Associate Attorney</w:t>
       </w:r>
     </w:p>
     <w:p>
@@ -44,7 +44,7 @@
         <w:tab/>
       </w:r>
       <w:r>
-        <w:t>[Current Date]</w:t>
+        <w:t>July 2025</w:t>
       </w:r>
     </w:p>
     <w:p>
@@ -56,7 +56,7 @@
         <w:tab/>
       </w:r>
       <w:r>
-        <w:t>Analysis of Second Amendment Framework in United States v. Vlha, 142 F.4th 1194 (9th Cir. 2025)</w:t>
+        <w:t>Analysis of Second Amendment Challenge to 18 U.S.C. § 922(a)(1)(A) Based on United States v. Vlha, 142 F.4th 1194 (9th Cir. 2025)</w:t>
       </w:r>
     </w:p>
     <w:p>
@@ -73,17 +73,35 @@
       </w:r>
     </w:p>
     <w:p>
+      <w:pPr>
+        <w:pStyle w:val="Heading2"/>
+      </w:pPr>
+      <w:r>
+        <w:t>I. Summary of the Case</w:t>
+      </w:r>
+    </w:p>
+    <w:p>
       <w:r>
         <w:rPr>
           <w:b w:val="0"/>
         </w:rPr>
-        <w:t>To: Senior Partner</w:t>
-        <w:br/>
-        <w:t>From: Associate</w:t>
-        <w:br/>
-        <w:t>Date: [Current Date]</w:t>
-        <w:br/>
-        <w:t>Re: Analysis of Second Amendment Framework in United States v. Vlha, 142 F.4th 1194 (9th Cir. 2025)</w:t>
+        <w:t>In United States v. Vlha, defendants James Vlha and Travis Schlotterbeck were convicted of conspiring to manufacture and sell semi-automatic AR-15 firearms without a federal license in Bellflower, California, in violation of 18 U.S.C. § 922(a)(1)(A). Schlotterbeck was also convicted under 18 U.S.C. § 922(d)(1) for selling a firearm to a confidential informant he believed was a felon. The defendants' conduct occurred in 2015 and 2016, including sales to undercover agents.</w:t>
+      </w:r>
+    </w:p>
+    <w:p>
+      <w:r>
+        <w:rPr>
+          <w:b w:val="0"/>
+        </w:rPr>
+        <w:t>Prior to trial, defendants filed a motion to dismiss the indictment under Federal Rule of Criminal Procedure 12(b)(3), arguing the statutes were unconstitutional under New York State Rifle &amp; Pistol Ass'n v. Bruen, 597 U.S. 1 (2022). The U.S. District Court for the Central District of California, presided over by Judge George H. Wu, denied the motion. The defendants then entered conditional guilty pleas, preserving their right to appeal the constitutional issue.</w:t>
+      </w:r>
+    </w:p>
+    <w:p>
+      <w:r>
+        <w:rPr>
+          <w:b w:val="0"/>
+        </w:rPr>
+        <w:t>The Ninth Circuit, in an opinion authored by Judge Danielle J. Forrest and joined by Judges Ronald M. Gould and Sandra S. Ikuta, affirmed the convictions. The court held that the Second Amendment did not apply to the defendants' conduct, thereby rejecting their facial and as-applied constitutional challenges to both statutes.</w:t>
       </w:r>
     </w:p>
     <w:p>
@@ -91,7 +109,7 @@
         <w:pStyle w:val="Heading2"/>
       </w:pPr>
       <w:r>
-        <w:t>I. Introduction</w:t>
+        <w:t>II. Legal Framework: The Bruen Analysis and Ancillary-Rights Doctrine</w:t>
       </w:r>
     </w:p>
     <w:p>
@@ -99,7 +117,7 @@
         <w:rPr>
           <w:b w:val="0"/>
         </w:rPr>
-        <w:t>This memorandum analyzes the Ninth Circuit's opinion in United States v. Vlha, 142 F.4th 1194 (9th Cir. 2025), which affirmed convictions under 18 U.S.C. § 922(a)(1)(A) (conspiracy to manufacture firearms for sale without a federal license) and 18 U.S.C. § 922(d)(1) (selling a firearm to a felon). The court rejected defendants' challenges that these statutes violate the Second Amendment under New York State Rifle &amp; Pistol Ass'n v. Bruen, 597 U.S. 1 (2022).</w:t>
+        <w:t>The court's analysis is governed by the framework established in New York State Rifle &amp; Pistol Ass'n v. Bruen, 597 U.S. 1 (2022). Under Bruen, a Second Amendment challenge requires a two-step inquiry. First, the court must determine whether "the Second Amendment's plain text" covers the regulated conduct. Id. at 24. If it does, the conduct is "presumptively protected," and the government must justify the regulation by demonstrating a historical tradition of comparable firearm regulation. Id. at 24, 27. However, if the text does not protect the conduct, the constitutional challenge fails at step one. B&amp;L Prods., Inc. v. Newsom, 104 F.4th 108, 120 (9th Cir. 2024).</w:t>
       </w:r>
     </w:p>
     <w:p>
@@ -107,7 +125,15 @@
         <w:rPr>
           <w:b w:val="0"/>
         </w:rPr>
-        <w:t>The opinion, authored by Judge Forrest and joined by Judges Gould and Ikuta, addresses two key questions: (1) whether the ancillary-rights doctrine survived Bruen, and (2) how the meaningful-constraint test applies to the regulated conduct. This analysis will assist in evaluating whether to recommend filing an amicus brief in support of a potential cert petition.</w:t>
+        <w:t>Because the defendants here are not individuals asserting a direct possessory right to "keep and bear Arms," the court applied its "ancillary-rights doctrine." This doctrine, which the Ninth Circuit has held was not abrogated by Bruen (see B&amp;L Prods., 104 F.4th at 120; Duncan v. Bonta, 133 F.4th 852, 866–67 (9th Cir. 2025) (en banc)), provides that the Second Amendment protects activities ancillary to the core possessory right only if the regulation of those activities "meaningfully constrain[s]" the core individual possessory right. Teixeira v. County of Alameda, 873 F.3d 670, 680 (9th Cir. 2017) (en banc).</w:t>
+      </w:r>
+    </w:p>
+    <w:p>
+      <w:r>
+        <w:rPr>
+          <w:b w:val="0"/>
+        </w:rPr>
+        <w:t>The meaningful-constraint test is applied at step one of the Bruen analysis to determine if the conduct is presumptively protected. B&amp;L Prods., 104 F.4th at 119. There is no freestanding right to sell firearms wholly detached from a customer's ability to acquire them. Teixeira, 873 F.3d at 682. A vendor challenging a firearms regulation must demonstrate that would-be purchasers' core right of possession is being meaningfully constrained. Id. at 678, 681–90.</w:t>
       </w:r>
     </w:p>
     <w:p>
@@ -115,7 +141,7 @@
         <w:pStyle w:val="Heading2"/>
       </w:pPr>
       <w:r>
-        <w:t>II. Background and Procedural History</w:t>
+        <w:t>III. Analysis of § 922(a)(1)(A): Unlicensed Manufacturing</w:t>
       </w:r>
     </w:p>
     <w:p>
@@ -123,7 +149,7 @@
         <w:rPr>
           <w:b w:val="0"/>
         </w:rPr>
-        <w:t>Defendants James Vlha and Travis Schlotterbeck conspired to manufacture and sell semi-automatic AR-15 firearms without a license in Bellflower, California. They accepted orders for custom assault weapons, created parts using specialized equipment, and assembled and sold the firearms. In 2015 and 2016, they manufactured custom assault weapons and unwittingly sold them to various undercover agents. Schlotterbeck also sold a firearm to a confidential informant who he believed was a felon.</w:t>
+        <w:t>The court first addressed the defendants' challenge to 18 U.S.C. § 922(a)(1)(A), which makes it unlawful for any person, except a licensed manufacturer, to engage in the business of manufacturing firearms. The court acknowledged that the ability to manufacture firearms facilitates individuals' ability to buy firearms, which in turn facilitates the core right to "keep and bear Arms." See Teixeira, 873 F.3d at 677. However, the statute does not prohibit manufacturing altogether; it only prohibits manufacturing "as a regular course of trade or business" without a license.</w:t>
       </w:r>
     </w:p>
     <w:p>
@@ -131,7 +157,7 @@
         <w:rPr>
           <w:b w:val="0"/>
         </w:rPr>
-        <w:t>Defendants were charged with conspiring to engage in the business of manufacturing and dealing firearms without a license under 18 U.S.C. § 922(a)(1)(A), and Schlotterbeck was additionally charged with selling a firearm to a felon under 18 U.S.C. § 922(d)(1).</w:t>
+        <w:t>The court emphasized that the federal licensing scheme is non-discretionary. Under 18 U.S.C. § 923(a) and (d), the required license must be issued if the applicant pays a filing fee, is at least 21 years old, has premises for conducting business, and is generally compliant with other laws. The court rejected the defendants' argument that this scheme creates a meaningful constraint, noting that in 2023 there were over 3,500 licensed firearms manufacturers in the United States and nearly 10 million firearms were manufactured by licensed manufacturers that year, according to ATF reports.</w:t>
       </w:r>
     </w:p>
     <w:p>
@@ -139,7 +165,7 @@
         <w:rPr>
           <w:b w:val="0"/>
         </w:rPr>
-        <w:t>Defendants moved to dismiss their indictment under Federal Rule of Criminal Procedure 12(b)(3) as unconstitutional under Bruen. The district court, with District Judge George H. Wu presiding, denied their motion. Defendants entered conditional pleas preserving their right to appeal that decision and timely appealed to the Ninth Circuit.</w:t>
+        <w:t>Applying the meaningful-constraint test, the court concluded that "requiring commercial firearm manufacturers to obtain licenses under the shall-issue scheme challenged here does not meaningfully constrain would-be purchasers from obtaining firearms." The court distinguished this from scenarios where a regulation meaningfully constrains possession, such as in Nguyen v. Bonta, --- F.4th ---, 2025 WL 1718079 (9th Cir. 2025), where a restriction limiting buyers to one firearm purchase per 30-day period was found to meaningfully constrain the core right. The court also cited Bruen's acknowledgment that any permitting scheme could potentially be abused, but noted the defendants had not shown any abuse in this case.</w:t>
       </w:r>
     </w:p>
     <w:p>
@@ -147,7 +173,7 @@
         <w:pStyle w:val="Heading2"/>
       </w:pPr>
       <w:r>
-        <w:t>III. The Ancillary-Rights Doctrine and Its Survival After Bruen</w:t>
+        <w:t>IV. Analysis of § 922(d)(1): Sale to a Felon</w:t>
       </w:r>
     </w:p>
     <w:p>
@@ -155,7 +181,7 @@
         <w:rPr>
           <w:b w:val="0"/>
         </w:rPr>
-        <w:t>The Ninth Circuit applied what it terms the "ancillary-rights doctrine" to analyze whether the Second Amendment's plain text covers the regulated conduct. Under this doctrine, where a challenger's direct possessory right to "keep and bear Arms" is not implicated, the Second Amendment's protection is limited to ancillary activities only if the regulation of such activities "meaningfully constrains" the core individual possessory right. Vlha, 142 F.4th at 1197-98 (citing Teixeira v. County of Alameda, 873 F.3d 670, 680 (9th Cir. 2017) (en banc)).</w:t>
+        <w:t>The court then addressed Travis Schlotterbeck's facial and as-applied challenges to 18 U.S.C. § 922(d)(1), which prohibits selling or disposing of a firearm to any person knowing or having reasonable cause to believe that person has been convicted of a felony. The court found this challenge straightforward in light of its precedent.</w:t>
       </w:r>
     </w:p>
     <w:p>
@@ -163,7 +189,7 @@
         <w:rPr>
           <w:b w:val="0"/>
         </w:rPr>
-        <w:t>The court held that Bruen did not abrogate this doctrine. The opinion states: "Bruen did not abrogate our ancillary-rights doctrine. B&amp;L Prods., 104 F.4th at 120; see also Duncan v. Bonta, 133 F.4th 852, 866-67 (9th Cir. 2025) (en banc)." Vlha, 142 F.4th at 1198. The court reasoned that the doctrine is based on the text of the Second Amendment, which prohibits "meaningful constraints" on the right to possess firearms. Id.</w:t>
+        <w:t>The court applied the ancillary-rights doctrine and asked whether the restriction against selling to felons meaningfully constrains the would-be purchasers' (i.e., felons') ability to possess firearms. The court relied heavily on its en banc decision in United States v. Duarte, 137 F.4th 743 (9th Cir. 2025). In Duarte, the Ninth Circuit held that while felons are part of "the people," 18 U.S.C. § 922(g)(1)'s ban on felons possessing firearms is justified by the nation's history and tradition of disarming people deemed dangerous. Id. at 752–55, 761–62. The court in Duarte concluded that history and tradition supported categorically disarming felons, including those convicted of non-violent offenses.</w:t>
       </w:r>
     </w:p>
     <w:p>
@@ -171,7 +197,7 @@
         <w:rPr>
           <w:b w:val="0"/>
         </w:rPr>
-        <w:t>The court noted that several sister circuits have adopted or endorsed similar tests, citing Gazzola v. Hochul, 88 F.4th 186, 196-97 (2d Cir. 2023), and McRorey v. Garland, 99 F.4th 831, 839 (5th Cir. 2024). Vlha, 142 F.4th at 1198.</w:t>
+        <w:t>The Vlha court reasoned that if felons have no Second Amendment right to keep and bear arms under Duarte, then they necessarily have no right to purchase firearms. Therefore, "Section 922(d)(1)'s prohibition on selling firearms to felons cannot meaningfully constrain the possessory rights of felons because they do not have possessory rights." The court rejected Schlotterbeck's argument that Duarte was distinguishable because it addressed § 922(g)(1) rather than § 922(d)(1), stating that the logic of Duarte dictates the outcome. The court cited the Sixth Circuit's agreement in United States v. Knipp, 138 F.4th 429, 435 (6th Cir. 2025).</w:t>
       </w:r>
     </w:p>
     <w:p>
@@ -179,7 +205,7 @@
         <w:pStyle w:val="Heading2"/>
       </w:pPr>
       <w:r>
-        <w:t>IV. Application to § 922(a)(1)(A)</w:t>
+        <w:t>V. Key Precedents</w:t>
       </w:r>
     </w:p>
     <w:p>
@@ -187,7 +213,7 @@
         <w:rPr>
           <w:b w:val="0"/>
         </w:rPr>
-        <w:t>The court applied the meaningful-constraint test to determine whether § 922(a)(1)(A)'s requirement that commercial firearm manufacturers obtain a federal license is presumptively protected by the Second Amendment. The court held that "the text of the Second Amendment does not cover the conduct regulated by § 922(a)(1)(A) because requiring commercial firearm manufacturers to obtain licenses—under a non-discretionary scheme that requires the license to be issued if the applicant pays a filing fee, is at least 21-years old, has premises on which to conduct his business, and is generally compliant with other laws—does not meaningfully constrain would-be purchasers from obtaining firearms." Vlha, 142 F.4th at 1196.</w:t>
+        <w:t>Several key precedents underpin the court's analysis. New York State Rifle &amp; Pistol Ass'n v. Bruen, 597 U.S. 1 (2022), is the foundational Supreme Court case that rejected means-ends balancing and required Second Amendment analysis to be rooted in constitutional text and historical tradition. The court used Bruen's two-step framework as the starting point for its analysis.</w:t>
       </w:r>
     </w:p>
     <w:p>
@@ -195,7 +221,7 @@
         <w:rPr>
           <w:b w:val="0"/>
         </w:rPr>
-        <w:t>The court emphasized that there is not "a freestanding right" to sell firearms that is "wholly detached from any customer's ability to acquire firearms." Id. at 1197 (citing Teixeira, 873 F.3d at 682). A vendor challenging a firearms regulation must demonstrate that would-be purchasers' core right of possession is being meaningfully constrained. Id. Here, because the licensing scheme is non-discretionary and does not impose substantial barriers, the defendants failed to show such a meaningful constraint.</w:t>
+        <w:t>United States v. Duarte, 137 F.4th 743 (9th Cir. 2025) (en banc), was critical to rejecting Schlotterbeck's challenge. Duarte held that although felons are part of "the people," the nation's history and tradition supports categorically disarming them. The Vlha court extended this logic to conclude that a prohibition on selling to felons cannot meaningfully constrain rights that felons do not possess.</w:t>
       </w:r>
     </w:p>
     <w:p>
@@ -203,7 +229,7 @@
         <w:rPr>
           <w:b w:val="0"/>
         </w:rPr>
-        <w:t>Thus, defendants' constitutional challenge to § 922(a)(1)(A) fails because the regulated conduct falls outside the Second Amendment's text. As the court stated, "if the text of the Second Amendment does not protect the conduct at issue, a constitutional challenge necessarily fails." Id. at 1197 (citing B&amp;L Prods., Inc. v. Newsom, 104 F.4th 108, 120 (9th Cir. 2024)).</w:t>
+        <w:t>Teixeira v. County of Alameda, 873 F.3d 670 (9th Cir. 2017) (en banc), established the ancillary-rights doctrine and the meaningful-constraint test in this circuit. It held that a zoning ordinance restricting gun store locations did not meaningfully constrain residents' ability to purchase firearms because they could "freely purchase firearms within the County." Id. at 679. B&amp;L Productions, Inc. v. Newsom, 104 F.4th 108 (9th Cir. 2024), confirmed that Bruen did not abrogate the ancillary-rights doctrine and applied the meaningful-constraint test to reject a challenge to restrictions on gun shows at state fairgrounds. Finally, Nguyen v. Bonta, 2025 WL 1718079 (9th Cir. 2025), provided a contrasting example where a 30-day one-purchase limit was found to meaningfully constrain the core right, illustrating the boundary of the meaningful-constraint test.</w:t>
       </w:r>
     </w:p>
     <w:p>
@@ -211,7 +237,7 @@
         <w:pStyle w:val="Heading2"/>
       </w:pPr>
       <w:r>
-        <w:t>V. Application to § 922(d)(1)</w:t>
+        <w:t>VI. Conclusion and Practical Implications</w:t>
       </w:r>
     </w:p>
     <w:p>
@@ -219,7 +245,7 @@
         <w:rPr>
           <w:b w:val="0"/>
         </w:rPr>
-        <w:t>The court also rejected Schlotterbeck's facial and as-applied challenges to § 922(d)(1), which prohibits selling a firearm to a felon. The court applied the same ancillary-rights framework, holding that "the logic of United States v. Duarte, 137 F.4th 743 (9th Cir. 2025) (en banc)—which held that 18 U.S.C. § 922(g)(1)'s ban on felons possessing firearms is justified by our nation's history and tradition of disarming people the legislature deems dangerous—dictates the outcome here." Vlha, 142 F.4th at 1196.</w:t>
+        <w:t>The Ninth Circuit's decision in United States v. Vlha firmly establishes that the Second Amendment, as interpreted through the ancillary-rights doctrine and meaningful-constraint test, does not provide a viable defense to charges of unlicensed firearms manufacturing under 18 U.S.C. § 922(a)(1)(A). The court's holding is grounded in its conclusion that the federal licensing scheme is a non-discretionary "shall-issue" system that does not meaningfully constrain would-be purchasers from obtaining firearms.</w:t>
       </w:r>
     </w:p>
     <w:p>
@@ -227,7 +253,7 @@
         <w:rPr>
           <w:b w:val="0"/>
         </w:rPr>
-        <w:t>The court reasoned that "Section § 922(d)(1)'s prohibition on sales to felons cannot meaningfully constrain the possessory rights of felons because they do not have possessory rights." Id. Since felons lack a Second Amendment right to possess firearms under Duarte, a prohibition on selling firearms to them cannot implicate any ancillary right to purchase. Therefore, the statute does not burden any constitutionally protected conduct.</w:t>
+        <w:t>For a client facing similar charges, this decision strongly suggests that a Second Amendment challenge to § 922(a)(1)(A) will not succeed. The key factors in the court's analysis were the availability of the license to any qualified applicant and the robust number of licensed manufacturers and firearms produced annually. A challenge might only gain traction if a defendant could demonstrate that the permitting scheme is being applied in an abusive manner, such as through excessive delays or exorbitant fees, as acknowledged by the Supreme Court in Bruen. However, the Vlha court noted that the defendants made no such showing.</w:t>
       </w:r>
     </w:p>
     <w:p>
@@ -235,31 +261,7 @@
         <w:rPr>
           <w:b w:val="0"/>
         </w:rPr>
-        <w:t>The court cited United States v. Rahimi, 602 U.S. 680, 693 (2024), for the standard that facial challenges require showing "'that no set of circumstances exists under which the [law] would be valid.'" Vlha, 142 F.4th at 1196. Schlotterbeck's challenges failed because § 922(d)(1) is valid as applied to sales to felons who have no possessory rights.</w:t>
-      </w:r>
-    </w:p>
-    <w:p>
-      <w:pPr>
-        <w:pStyle w:val="Heading2"/>
-      </w:pPr>
-      <w:r>
-        <w:t>VI. Conclusion</w:t>
-      </w:r>
-    </w:p>
-    <w:p>
-      <w:r>
-        <w:rPr>
-          <w:b w:val="0"/>
-        </w:rPr>
-        <w:t>The Ninth Circuit affirmed both convictions. For § 922(a)(1)(A), the court held that the licensing requirement does not meaningfully constrain purchasers' core possessory rights and thus falls outside the Second Amendment's text. For § 922(d)(1), the court held that because felons lack possessory rights, a ban on selling firearms to them cannot burden any constitutionally protected conduct.</w:t>
-      </w:r>
-    </w:p>
-    <w:p>
-      <w:r>
-        <w:rPr>
-          <w:b w:val="0"/>
-        </w:rPr>
-        <w:t>The opinion demonstrates the court's continued application of the ancillary-rights doctrine after Bruen, relying on the meaningful-constraint test as a textual interpretation of the Second Amendment. This framework may present a significant question for the Supreme Court regarding the scope of Second Amendment protections for commercial firearms activities and sales to prohibited persons.</w:t>
+        <w:t>In summary, after Vlha, the viability of a facial or as-applied Second Amendment challenge to 18 U.S.C. § 922(a)(1)(A) is extremely low. The decision, by applying the ancillary-rights doctrine post-Bruen, provides a clear framework that insulates federal licensing requirements for commercial firearms manufacturers from constitutional attack, provided the scheme remains non-discretionary and does not impose meaningful constraints on the public's ability to acquire firearms.</w:t>
       </w:r>
     </w:p>
     <w:sectPr>

</xml_diff>